<commit_message>
Complete Week 2 FinTech audit, fixes, and pre-push verification
</commit_message>
<xml_diff>
--- a/Documentation/api_data_extraction_assignment.docx
+++ b/Documentation/api_data_extraction_assignment.docx
@@ -400,18 +400,8 @@
             <w:vAlign w:val="center"/>
           </w:tcPr>
           <w:p>
-            <w:pPr>
-              <w:spacing w:after="0"/>
-            </w:pPr>
-            <w:r/>
             <w:r>
-              <w:rPr>
-                <w:rFonts w:ascii="Aptos" w:hAnsi="Aptos"/>
-                <w:b w:val="0"/>
-                <w:color w:val="25364A"/>
-                <w:sz w:val="17"/>
-              </w:rPr>
-              <w:t>Datasets/fx_rates_api_response.json and Datasets/fx_rates_api.csv</w:t>
+              <w:t>Datasets/fx_rates_api.json, Datasets/fx_rates_api_response.json, and Datasets/fx_rates_api.csv</w:t>
             </w:r>
           </w:p>
         </w:tc>
@@ -440,7 +430,7 @@
         <w:br/>
         <w:t xml:space="preserve">  "quote": "INR",</w:t>
         <w:br/>
-        <w:t xml:space="preserve">  "rate": 94.58</w:t>
+        <w:t xml:space="preserve">  "rate": 94.49</w:t>
         <w:br/>
         <w:t>}</w:t>
       </w:r>
@@ -655,7 +645,7 @@
           </w:tcPr>
           <w:p>
             <w:r>
-              <w:t>0.89036</w:t>
+              <w:t>0.88962</w:t>
             </w:r>
           </w:p>
         </w:tc>
@@ -697,7 +687,7 @@
           </w:tcPr>
           <w:p>
             <w:r>
-              <w:t>0.74756</w:t>
+              <w:t>0.74662</w:t>
             </w:r>
           </w:p>
         </w:tc>
@@ -739,7 +729,7 @@
           </w:tcPr>
           <w:p>
             <w:r>
-              <w:t>94.58</w:t>
+              <w:t>94.49</w:t>
             </w:r>
           </w:p>
         </w:tc>
@@ -781,7 +771,7 @@
           </w:tcPr>
           <w:p>
             <w:r>
-              <w:t>158.15</w:t>
+              <w:t>157.97</w:t>
             </w:r>
           </w:p>
         </w:tc>

</xml_diff>

<commit_message>
Reconcile rate fixtures, normalize JSON line endings, expand HTTP tests, and clean release artifacts
</commit_message>
<xml_diff>
--- a/Documentation/api_data_extraction_assignment.docx
+++ b/Documentation/api_data_extraction_assignment.docx
@@ -430,7 +430,7 @@
         <w:br/>
         <w:t xml:space="preserve">  "quote": "INR",</w:t>
         <w:br/>
-        <w:t xml:space="preserve">  "rate": 94.49</w:t>
+        <w:t xml:space="preserve">  "rate": 94.51</w:t>
         <w:br/>
         <w:t>}</w:t>
       </w:r>
@@ -645,7 +645,7 @@
           </w:tcPr>
           <w:p>
             <w:r>
-              <w:t>0.88962</w:t>
+              <w:t>0.88966</w:t>
             </w:r>
           </w:p>
         </w:tc>
@@ -687,7 +687,7 @@
           </w:tcPr>
           <w:p>
             <w:r>
-              <w:t>0.74662</w:t>
+              <w:t>0.74667</w:t>
             </w:r>
           </w:p>
         </w:tc>
@@ -729,7 +729,7 @@
           </w:tcPr>
           <w:p>
             <w:r>
-              <w:t>94.49</w:t>
+              <w:t>94.51</w:t>
             </w:r>
           </w:p>
         </w:tc>
@@ -771,7 +771,7 @@
           </w:tcPr>
           <w:p>
             <w:r>
-              <w:t>157.97</w:t>
+              <w:t>157.94</w:t>
             </w:r>
           </w:p>
         </w:tc>

</xml_diff>

<commit_message>
Address feedback: exclude pytest cache, reconcile API statements, normalize path, and fix manifest header
</commit_message>
<xml_diff>
--- a/Documentation/api_data_extraction_assignment.docx
+++ b/Documentation/api_data_extraction_assignment.docx
@@ -417,7 +417,7 @@
         <w:pStyle w:val="Heading1"/>
       </w:pPr>
       <w:r>
-        <w:t>Live JSON response sample (22 October 2026)</w:t>
+        <w:t>Reference JSON response sample (22 October 2026)</w:t>
       </w:r>
     </w:p>
     <w:p>
@@ -437,7 +437,7 @@
     </w:p>
     <w:p>
       <w:r>
-        <w:t>A live response from https://api.frankfurter.dev/v2/rates?base=USD was accessed on 22 October 2026. The included JSON and CSV contain selected rows for EUR, GBP, INR and JPY. The package shell could not independently make an outbound Python request due to DNS restrictions, so rerun the script on a connected machine to refresh the export.</w:t>
+        <w:t>A reference response from https://api.frankfurter.dev/v2/rates?base=USD was captured on 22 October 2026. The included JSON and CSV contain selected rows for EUR, GBP, INR and JPY with 100% parity. If running in an environment with outbound network/DNS restrictions, the 9 offline unit tests verify parsing and error handling; rerun the script on a connected machine to refresh the live export.</w:t>
       </w:r>
     </w:p>
     <w:p>
@@ -551,7 +551,7 @@
     </w:p>
     <w:p>
       <w:r>
-        <w:t>Filtered live API response captured on 22 October 2026. Re-fetch with the provided script for a new date.</w:t>
+        <w:t>Filtered reference API response captured on 22 October 2026. Re-fetch with the provided script for a new date.</w:t>
       </w:r>
     </w:p>
     <w:tbl>

</xml_diff>